<commit_message>
Docs(design_docs): Add Domain Event for CFVer1CheclistBase
</commit_message>
<xml_diff>
--- a/MainDocs/CFVer1ChecklistBase.docx
+++ b/MainDocs/CFVer1ChecklistBase.docx
@@ -718,6 +718,176 @@
                 <w:lang w:val="vi-VN"/>
               </w:rPr>
               <w:t>Checklist-Owner xóa Checklist</w:t>
+            </w:r>
+          </w:p>
+        </w:tc>
+      </w:tr>
+      <w:tr>
+        <w:tc>
+          <w:tcPr>
+            <w:tcW w:w="3021" w:type="dxa"/>
+          </w:tcPr>
+          <w:p>
+            <w:pPr>
+              <w:jc w:val="left"/>
+              <w:rPr>
+                <w:rFonts w:cs="Times New Roman"/>
+                <w:szCs w:val="26"/>
+              </w:rPr>
+            </w:pPr>
+            <w:r>
+              <w:rPr>
+                <w:rFonts w:cs="Times New Roman"/>
+                <w:szCs w:val="26"/>
+              </w:rPr>
+              <w:t>Update Check</w:t>
+            </w:r>
+          </w:p>
+        </w:tc>
+        <w:tc>
+          <w:tcPr>
+            <w:tcW w:w="3021" w:type="dxa"/>
+          </w:tcPr>
+          <w:p>
+            <w:pPr>
+              <w:jc w:val="left"/>
+              <w:rPr>
+                <w:rFonts w:cs="Times New Roman"/>
+                <w:szCs w:val="26"/>
+                <w:lang w:val="vi-VN"/>
+              </w:rPr>
+            </w:pPr>
+            <w:r>
+              <w:rPr>
+                <w:rFonts w:cs="Times New Roman"/>
+                <w:szCs w:val="26"/>
+                <w:lang w:val="vi-VN"/>
+              </w:rPr>
+              <w:t>User</w:t>
+            </w:r>
+          </w:p>
+        </w:tc>
+        <w:tc>
+          <w:tcPr>
+            <w:tcW w:w="3021" w:type="dxa"/>
+          </w:tcPr>
+          <w:p>
+            <w:pPr>
+              <w:jc w:val="left"/>
+              <w:rPr>
+                <w:rFonts w:cs="Times New Roman"/>
+                <w:szCs w:val="26"/>
+                <w:lang w:val="vi-VN"/>
+              </w:rPr>
+            </w:pPr>
+            <w:r>
+              <w:rPr>
+                <w:rFonts w:cs="Times New Roman"/>
+                <w:szCs w:val="26"/>
+                <w:lang w:val="vi-VN"/>
+              </w:rPr>
+              <w:t>Checklist-Owner</w:t>
+            </w:r>
+            <w:r>
+              <w:rPr>
+                <w:rFonts w:cs="Times New Roman"/>
+                <w:szCs w:val="26"/>
+              </w:rPr>
+              <w:t xml:space="preserve"> </w:t>
+            </w:r>
+            <w:r>
+              <w:rPr>
+                <w:rFonts w:cs="Times New Roman"/>
+                <w:szCs w:val="26"/>
+                <w:lang w:val="vi-VN"/>
+              </w:rPr>
+              <w:t>cập nhật Check</w:t>
+            </w:r>
+          </w:p>
+        </w:tc>
+      </w:tr>
+      <w:tr>
+        <w:tc>
+          <w:tcPr>
+            <w:tcW w:w="3021" w:type="dxa"/>
+          </w:tcPr>
+          <w:p>
+            <w:pPr>
+              <w:jc w:val="left"/>
+              <w:rPr>
+                <w:rFonts w:cs="Times New Roman"/>
+                <w:szCs w:val="26"/>
+                <w:lang w:val="vi-VN"/>
+              </w:rPr>
+            </w:pPr>
+            <w:r>
+              <w:rPr>
+                <w:rFonts w:cs="Times New Roman"/>
+                <w:szCs w:val="26"/>
+              </w:rPr>
+              <w:t>Rename</w:t>
+            </w:r>
+            <w:r>
+              <w:rPr>
+                <w:rFonts w:cs="Times New Roman"/>
+                <w:szCs w:val="26"/>
+                <w:lang w:val="vi-VN"/>
+              </w:rPr>
+              <w:t xml:space="preserve"> Checklist</w:t>
+            </w:r>
+          </w:p>
+        </w:tc>
+        <w:tc>
+          <w:tcPr>
+            <w:tcW w:w="3021" w:type="dxa"/>
+          </w:tcPr>
+          <w:p>
+            <w:pPr>
+              <w:jc w:val="left"/>
+              <w:rPr>
+                <w:rFonts w:cs="Times New Roman"/>
+                <w:szCs w:val="26"/>
+                <w:lang w:val="vi-VN"/>
+              </w:rPr>
+            </w:pPr>
+            <w:r>
+              <w:rPr>
+                <w:rFonts w:cs="Times New Roman"/>
+                <w:szCs w:val="26"/>
+                <w:lang w:val="vi-VN"/>
+              </w:rPr>
+              <w:t>User</w:t>
+            </w:r>
+          </w:p>
+        </w:tc>
+        <w:tc>
+          <w:tcPr>
+            <w:tcW w:w="3021" w:type="dxa"/>
+          </w:tcPr>
+          <w:p>
+            <w:pPr>
+              <w:jc w:val="left"/>
+              <w:rPr>
+                <w:rFonts w:cs="Times New Roman"/>
+                <w:szCs w:val="26"/>
+                <w:lang w:val="vi-VN"/>
+              </w:rPr>
+            </w:pPr>
+            <w:r>
+              <w:rPr>
+                <w:rFonts w:cs="Times New Roman"/>
+                <w:szCs w:val="26"/>
+                <w:lang w:val="vi-VN"/>
+              </w:rPr>
+              <w:t xml:space="preserve">Checklist-Owner sửa tên </w:t>
+            </w:r>
+            <w:r>
+              <w:rPr>
+                <w:rFonts w:cs="Times New Roman"/>
+                <w:szCs w:val="26"/>
+                <w:lang w:val="vi-VN"/>
+              </w:rPr>
+              <w:t>Checklist</w:t>
             </w:r>
           </w:p>
         </w:tc>
@@ -923,6 +1093,7 @@
                 <w:rFonts w:cs="Times New Roman"/>
                 <w:szCs w:val="26"/>
               </w:rPr>
+              <w:lastRenderedPageBreak/>
               <w:t>Onboarding/Login</w:t>
             </w:r>
           </w:p>
@@ -1120,7 +1291,6 @@
                 <w:rFonts w:cs="Times New Roman"/>
                 <w:szCs w:val="26"/>
               </w:rPr>
-              <w:lastRenderedPageBreak/>
               <w:t>Save</w:t>
             </w:r>
             <w:r>
@@ -2602,7 +2772,6 @@
           <w:szCs w:val="26"/>
           <w:lang w:val="vi-VN"/>
         </w:rPr>
-        <w:lastRenderedPageBreak/>
         <w:t xml:space="preserve">2. </w:t>
       </w:r>
     </w:p>
@@ -4269,7 +4438,6 @@
                 <w:rFonts w:cs="Times New Roman"/>
                 <w:szCs w:val="26"/>
               </w:rPr>
-              <w:lastRenderedPageBreak/>
               <w:t>Checklist Framework</w:t>
             </w:r>
           </w:p>
@@ -5138,6 +5306,7 @@
           <w:rFonts w:eastAsia="Times New Roman" w:cs="Times New Roman"/>
           <w:szCs w:val="26"/>
         </w:rPr>
+        <w:lastRenderedPageBreak/>
         <w:t xml:space="preserve">   • Show modal/toast error</w:t>
       </w:r>
     </w:p>
@@ -5218,7 +5387,6 @@
           <w:rFonts w:eastAsia="Times New Roman" w:cs="Times New Roman"/>
           <w:szCs w:val="26"/>
         </w:rPr>
-        <w:lastRenderedPageBreak/>
         <w:t>- Each Save includes `checklist.version` or `lastUpdatedAt`</w:t>
       </w:r>
     </w:p>
@@ -6324,6 +6492,7 @@
           <w:bCs/>
           <w:szCs w:val="26"/>
         </w:rPr>
+        <w:lastRenderedPageBreak/>
         <w:t>2</w:t>
       </w:r>
       <w:r>
@@ -6506,7 +6675,6 @@
                 <w:rFonts w:cs="Times New Roman"/>
                 <w:szCs w:val="26"/>
               </w:rPr>
-              <w:lastRenderedPageBreak/>
               <w:t>Auto Save</w:t>
             </w:r>
           </w:p>
@@ -6786,7 +6954,7 @@
 <w:numbering xmlns:wpc="http://schemas.microsoft.com/office/word/2010/wordprocessingCanvas" xmlns:cx="http://schemas.microsoft.com/office/drawing/2014/chartex" xmlns:cx1="http://schemas.microsoft.com/office/drawing/2015/9/8/chartex" xmlns:cx2="http://schemas.microsoft.com/office/drawing/2015/10/21/chartex" xmlns:cx3="http://schemas.microsoft.com/office/drawing/2016/5/9/chartex" xmlns:cx4="http://schemas.microsoft.com/office/drawing/2016/5/10/chartex" xmlns:cx5="http://schemas.microsoft.com/office/drawing/2016/5/11/chartex" xmlns:cx6="http://schemas.microsoft.com/office/drawing/2016/5/12/chartex" xmlns:cx7="http://schemas.microsoft.com/office/drawing/2016/5/13/chartex" xmlns:cx8="http://schemas.microsoft.com/office/drawing/2016/5/14/chartex" xmlns:mc="http://schemas.openxmlformats.org/markup-compatibility/2006" xmlns:aink="http://schemas.microsoft.com/office/drawing/2016/ink" xmlns:am3d="http://schemas.microsoft.com/office/drawing/2017/model3d" xmlns:o="urn:schemas-microsoft-com:office:office" xmlns:r="http://schemas.openxmlformats.org/officeDocument/2006/relationships" xmlns:m="http://schemas.openxmlformats.org/officeDocument/2006/math" xmlns:v="urn:schemas-microsoft-com:vml" xmlns:wp14="http://schemas.microsoft.com/office/word/2010/wordprocessingDrawing" xmlns:wp="http://schemas.openxmlformats.org/drawingml/2006/wordprocessingDrawing" xmlns:w10="urn:schemas-microsoft-com:office:word" xmlns:w="http://schemas.openxmlformats.org/wordprocessingml/2006/main" xmlns:w14="http://schemas.microsoft.com/office/word/2010/wordml" xmlns:w15="http://schemas.microsoft.com/office/word/2012/wordml" xmlns:w16cex="http://schemas.microsoft.com/office/word/2018/wordml/cex" xmlns:w16cid="http://schemas.microsoft.com/office/word/2016/wordml/cid" xmlns:w16="http://schemas.microsoft.com/office/word/2018/wordml" xmlns:w16sdtdh="http://schemas.microsoft.com/office/word/2020/wordml/sdtdatahash" xmlns:w16se="http://schemas.microsoft.com/office/word/2015/wordml/symex" xmlns:wpg="http://schemas.microsoft.com/office/word/2010/wordprocessingGroup" xmlns:wpi="http://schemas.microsoft.com/office/word/2010/wordprocessingInk" xmlns:wne="http://schemas.microsoft.com/office/word/2006/wordml" xmlns:wps="http://schemas.microsoft.com/office/word/2010/wordprocessingShape" mc:Ignorable="w14 w15 w16se w16cid w16 w16cex w16sdtdh wp14">
   <w:numPicBullet w:numPicBulletId="0">
     <w:pict>
-      <v:rect id="_x0000_i1048" style="width:0;height:1.5pt" o:hralign="center" o:bullet="t" o:hrstd="t" o:hr="t" fillcolor="#a0a0a0" stroked="f"/>
+      <v:rect id="_x0000_i1047" style="width:0;height:1.5pt" o:hralign="center" o:bullet="t" o:hrstd="t" o:hr="t" fillcolor="#a0a0a0" stroked="f"/>
     </w:pict>
   </w:numPicBullet>
   <w:abstractNum w:abstractNumId="0" w15:restartNumberingAfterBreak="0">

</xml_diff>